<commit_message>
Complete README redesign: symmetric stats, colorful project cards, typing SVGs, snake animation
</commit_message>
<xml_diff>
--- a/Compiler_Design_Project_Report.docx
+++ b/Compiler_Design_Project_Report.docx
@@ -2,46 +2,6 @@
 <file path=word/document.xml><?xml version="1.0" encoding="utf-8"?>
 <w:document xmlns:wpc="http://schemas.microsoft.com/office/word/2010/wordprocessingCanvas" xmlns:mo="http://schemas.microsoft.com/office/mac/office/2008/main" xmlns:mc="http://schemas.openxmlformats.org/markup-compatibility/2006" xmlns:mv="urn:schemas-microsoft-com:mac:vml" xmlns:o="urn:schemas-microsoft-com:office:office" xmlns:r="http://schemas.openxmlformats.org/officeDocument/2006/relationships" xmlns:m="http://schemas.openxmlformats.org/officeDocument/2006/math" xmlns:v="urn:schemas-microsoft-com:vml" xmlns:wp14="http://schemas.microsoft.com/office/word/2010/wordprocessingDrawing" xmlns:wp="http://schemas.openxmlformats.org/drawingml/2006/wordprocessingDrawing" xmlns:w10="urn:schemas-microsoft-com:office:word" xmlns:w="http://schemas.openxmlformats.org/wordprocessingml/2006/main" xmlns:w14="http://schemas.microsoft.com/office/word/2010/wordml" xmlns:wpg="http://schemas.microsoft.com/office/word/2010/wordprocessingGroup" xmlns:wpi="http://schemas.microsoft.com/office/word/2010/wordprocessingInk" xmlns:wne="http://schemas.microsoft.com/office/word/2006/wordml" xmlns:wps="http://schemas.microsoft.com/office/word/2010/wordprocessingShape" mc:Ignorable="w14 wp14">
   <w:body>
-    <w:p>
-      <w:pPr>
-        <w:spacing w:before="0" w:after="480"/>
-        <w:jc w:val="center"/>
-      </w:pPr>
-      <w:r>
-        <w:drawing>
-          <wp:inline xmlns:a="http://schemas.openxmlformats.org/drawingml/2006/main" xmlns:pic="http://schemas.openxmlformats.org/drawingml/2006/picture">
-            <wp:extent cx="2286000" cy="1090495"/>
-            <wp:docPr id="1" name="Picture 1"/>
-            <wp:cNvGraphicFramePr>
-              <a:graphicFrameLocks noChangeAspect="1"/>
-            </wp:cNvGraphicFramePr>
-            <a:graphic>
-              <a:graphicData uri="http://schemas.openxmlformats.org/drawingml/2006/picture">
-                <pic:pic>
-                  <pic:nvPicPr>
-                    <pic:cNvPr id="0" name="istun_logo.png"/>
-                    <pic:cNvPicPr/>
-                  </pic:nvPicPr>
-                  <pic:blipFill>
-                    <a:blip r:embed="rId11"/>
-                    <a:stretch>
-                      <a:fillRect/>
-                    </a:stretch>
-                  </pic:blipFill>
-                  <pic:spPr>
-                    <a:xfrm>
-                      <a:off x="0" y="0"/>
-                      <a:ext cx="2286000" cy="1090495"/>
-                    </a:xfrm>
-                    <a:prstGeom prst="rect"/>
-                  </pic:spPr>
-                </pic:pic>
-              </a:graphicData>
-            </a:graphic>
-          </wp:inline>
-        </w:drawing>
-      </w:r>
-    </w:p>
     <w:p>
       <w:pPr>
         <w:spacing w:before="240" w:after="80"/>
@@ -225,6 +185,349 @@
         <w:t>Date of Submission: June 2, 2026</w:t>
       </w:r>
     </w:p>
+    <w:p>
+      <w:r>
+        <w:br w:type="page"/>
+      </w:r>
+    </w:p>
+    <w:p>
+      <w:pPr>
+        <w:spacing w:before="240" w:after="360"/>
+      </w:pPr>
+      <w:r>
+        <w:rPr>
+          <w:rFonts w:ascii="Calibri" w:hAnsi="Calibri"/>
+          <w:b/>
+          <w:color w:val="1F497D"/>
+          <w:sz w:val="32"/>
+        </w:rPr>
+        <w:t>Individual Responsibility &amp; Data Structure Declaration</w:t>
+      </w:r>
+    </w:p>
+    <w:p>
+      <w:pPr>
+        <w:spacing w:before="0" w:after="240" w:line="276" w:lineRule="auto"/>
+      </w:pPr>
+      <w:r>
+        <w:rPr>
+          <w:rFonts w:ascii="Calibri" w:hAnsi="Calibri"/>
+          <w:sz w:val="22"/>
+        </w:rPr>
+        <w:t>In accordance with the Compiler Design Final Project Video Demo Guidelines, the table below declares the individual responsibilities, component ownership, data structures utilized, and the video presentation timestamps for each group member:</w:t>
+      </w:r>
+    </w:p>
+    <w:tbl>
+      <w:tblPr>
+        <w:tblW w:type="auto" w:w="0"/>
+        <w:jc w:val="center"/>
+        <w:tblLayout w:type="fixed"/>
+        <w:tblLook w:firstColumn="1" w:firstRow="1" w:lastColumn="0" w:lastRow="0" w:noHBand="0" w:noVBand="1" w:val="04A0"/>
+      </w:tblPr>
+      <w:tblGrid>
+        <w:gridCol w:w="2340"/>
+        <w:gridCol w:w="2340"/>
+        <w:gridCol w:w="2340"/>
+        <w:gridCol w:w="2340"/>
+      </w:tblGrid>
+      <w:tr>
+        <w:tc>
+          <w:tcPr>
+            <w:tcW w:type="dxa" w:w="2340"/>
+            <w:shd w:fill="1F497D"/>
+            <w:tcMar>
+              <w:top w:w="120" w:type="dxa"/>
+              <w:bottom w:w="120" w:type="dxa"/>
+              <w:left w:w="150" w:type="dxa"/>
+              <w:right w:w="150" w:type="dxa"/>
+            </w:tcMar>
+          </w:tcPr>
+          <w:p>
+            <w:pPr>
+              <w:jc w:val="left"/>
+            </w:pPr>
+            <w:r>
+              <w:rPr>
+                <w:b/>
+                <w:color w:val="FFFFFF"/>
+                <w:sz w:val="20"/>
+              </w:rPr>
+              <w:t>Student Name &amp; ID</w:t>
+            </w:r>
+          </w:p>
+        </w:tc>
+        <w:tc>
+          <w:tcPr>
+            <w:tcW w:type="dxa" w:w="2340"/>
+            <w:shd w:fill="1F497D"/>
+            <w:tcMar>
+              <w:top w:w="120" w:type="dxa"/>
+              <w:bottom w:w="120" w:type="dxa"/>
+              <w:left w:w="150" w:type="dxa"/>
+              <w:right w:w="150" w:type="dxa"/>
+            </w:tcMar>
+          </w:tcPr>
+          <w:p>
+            <w:pPr>
+              <w:jc w:val="left"/>
+            </w:pPr>
+            <w:r>
+              <w:rPr>
+                <w:b/>
+                <w:color w:val="FFFFFF"/>
+                <w:sz w:val="20"/>
+              </w:rPr>
+              <w:t>Component(s) Coded</w:t>
+            </w:r>
+          </w:p>
+        </w:tc>
+        <w:tc>
+          <w:tcPr>
+            <w:tcW w:type="dxa" w:w="2340"/>
+            <w:shd w:fill="1F497D"/>
+            <w:tcMar>
+              <w:top w:w="120" w:type="dxa"/>
+              <w:bottom w:w="120" w:type="dxa"/>
+              <w:left w:w="150" w:type="dxa"/>
+              <w:right w:w="150" w:type="dxa"/>
+            </w:tcMar>
+          </w:tcPr>
+          <w:p>
+            <w:pPr>
+              <w:jc w:val="left"/>
+            </w:pPr>
+            <w:r>
+              <w:rPr>
+                <w:b/>
+                <w:color w:val="FFFFFF"/>
+                <w:sz w:val="20"/>
+              </w:rPr>
+              <w:t>Data Structures Used</w:t>
+            </w:r>
+          </w:p>
+        </w:tc>
+        <w:tc>
+          <w:tcPr>
+            <w:tcW w:type="dxa" w:w="2340"/>
+            <w:shd w:fill="1F497D"/>
+            <w:tcMar>
+              <w:top w:w="120" w:type="dxa"/>
+              <w:bottom w:w="120" w:type="dxa"/>
+              <w:left w:w="150" w:type="dxa"/>
+              <w:right w:w="150" w:type="dxa"/>
+            </w:tcMar>
+          </w:tcPr>
+          <w:p>
+            <w:pPr>
+              <w:jc w:val="left"/>
+            </w:pPr>
+            <w:r>
+              <w:rPr>
+                <w:b/>
+                <w:color w:val="FFFFFF"/>
+                <w:sz w:val="20"/>
+              </w:rPr>
+              <w:t>Video Timestamp</w:t>
+            </w:r>
+          </w:p>
+        </w:tc>
+      </w:tr>
+      <w:tr>
+        <w:tc>
+          <w:tcPr>
+            <w:tcW w:type="dxa" w:w="2340"/>
+            <w:tcMar>
+              <w:top w:w="100" w:type="dxa"/>
+              <w:bottom w:w="100" w:type="dxa"/>
+              <w:left w:w="150" w:type="dxa"/>
+              <w:right w:w="150" w:type="dxa"/>
+            </w:tcMar>
+            <w:shd w:fill="F2F5F8"/>
+          </w:tcPr>
+          <w:p>
+            <w:r>
+              <w:rPr>
+                <w:rFonts w:ascii="Calibri" w:hAnsi="Calibri"/>
+                <w:sz w:val="19"/>
+              </w:rPr>
+              <w:t>Sercan Özkan</w:t>
+              <w:br/>
+              <w:t>(220611005)</w:t>
+            </w:r>
+          </w:p>
+        </w:tc>
+        <w:tc>
+          <w:tcPr>
+            <w:tcW w:type="dxa" w:w="2340"/>
+            <w:tcMar>
+              <w:top w:w="100" w:type="dxa"/>
+              <w:bottom w:w="100" w:type="dxa"/>
+              <w:left w:w="150" w:type="dxa"/>
+              <w:right w:w="150" w:type="dxa"/>
+            </w:tcMar>
+            <w:shd w:fill="F2F5F8"/>
+          </w:tcPr>
+          <w:p>
+            <w:r>
+              <w:rPr>
+                <w:rFonts w:ascii="Calibri" w:hAnsi="Calibri"/>
+                <w:sz w:val="19"/>
+              </w:rPr>
+              <w:t>Lexer / Scanner,</w:t>
+              <w:br/>
+              <w:t>Parser / Syntax Analyzer,</w:t>
+              <w:br/>
+              <w:t>TAC Generator</w:t>
+            </w:r>
+          </w:p>
+        </w:tc>
+        <w:tc>
+          <w:tcPr>
+            <w:tcW w:type="dxa" w:w="2340"/>
+            <w:tcMar>
+              <w:top w:w="100" w:type="dxa"/>
+              <w:bottom w:w="100" w:type="dxa"/>
+              <w:left w:w="150" w:type="dxa"/>
+              <w:right w:w="150" w:type="dxa"/>
+            </w:tcMar>
+            <w:shd w:fill="F2F5F8"/>
+          </w:tcPr>
+          <w:p>
+            <w:r>
+              <w:rPr>
+                <w:rFonts w:ascii="Calibri" w:hAnsi="Calibri"/>
+                <w:sz w:val="19"/>
+              </w:rPr>
+              <w:t>• List (Token Stream)</w:t>
+              <w:br/>
+              <w:t>• Stack (Parentheses parsing)</w:t>
+              <w:br/>
+              <w:t>• Tree Nodes (AST representation)</w:t>
+              <w:br/>
+              <w:t>• Map (DFA character transitions)</w:t>
+            </w:r>
+          </w:p>
+        </w:tc>
+        <w:tc>
+          <w:tcPr>
+            <w:tcW w:type="dxa" w:w="2340"/>
+            <w:tcMar>
+              <w:top w:w="100" w:type="dxa"/>
+              <w:bottom w:w="100" w:type="dxa"/>
+              <w:left w:w="150" w:type="dxa"/>
+              <w:right w:w="150" w:type="dxa"/>
+            </w:tcMar>
+            <w:shd w:fill="F2F5F8"/>
+          </w:tcPr>
+          <w:p>
+            <w:r>
+              <w:rPr>
+                <w:rFonts w:ascii="Calibri" w:hAnsi="Calibri"/>
+                <w:sz w:val="19"/>
+              </w:rPr>
+              <w:t>00:00 - 06:30</w:t>
+            </w:r>
+          </w:p>
+        </w:tc>
+      </w:tr>
+      <w:tr>
+        <w:tc>
+          <w:tcPr>
+            <w:tcW w:type="dxa" w:w="2340"/>
+            <w:tcMar>
+              <w:top w:w="100" w:type="dxa"/>
+              <w:bottom w:w="100" w:type="dxa"/>
+              <w:left w:w="150" w:type="dxa"/>
+              <w:right w:w="150" w:type="dxa"/>
+            </w:tcMar>
+            <w:shd w:fill="FFFFFF"/>
+          </w:tcPr>
+          <w:p>
+            <w:r>
+              <w:rPr>
+                <w:rFonts w:ascii="Calibri" w:hAnsi="Calibri"/>
+                <w:sz w:val="19"/>
+              </w:rPr>
+              <w:t>Berat Kahraman</w:t>
+              <w:br/>
+              <w:t>(220610038)</w:t>
+            </w:r>
+          </w:p>
+        </w:tc>
+        <w:tc>
+          <w:tcPr>
+            <w:tcW w:type="dxa" w:w="2340"/>
+            <w:tcMar>
+              <w:top w:w="100" w:type="dxa"/>
+              <w:bottom w:w="100" w:type="dxa"/>
+              <w:left w:w="150" w:type="dxa"/>
+              <w:right w:w="150" w:type="dxa"/>
+            </w:tcMar>
+            <w:shd w:fill="FFFFFF"/>
+          </w:tcPr>
+          <w:p>
+            <w:r>
+              <w:rPr>
+                <w:rFonts w:ascii="Calibri" w:hAnsi="Calibri"/>
+                <w:sz w:val="19"/>
+              </w:rPr>
+              <w:t>Static Semantic Analyzer,</w:t>
+              <w:br/>
+              <w:t>Memory Simulator,</w:t>
+              <w:br/>
+              <w:t>Visual UI / OS Dashboard,</w:t>
+              <w:br/>
+              <w:t>Documentation</w:t>
+            </w:r>
+          </w:p>
+        </w:tc>
+        <w:tc>
+          <w:tcPr>
+            <w:tcW w:type="dxa" w:w="2340"/>
+            <w:tcMar>
+              <w:top w:w="100" w:type="dxa"/>
+              <w:bottom w:w="100" w:type="dxa"/>
+              <w:left w:w="150" w:type="dxa"/>
+              <w:right w:w="150" w:type="dxa"/>
+            </w:tcMar>
+            <w:shd w:fill="FFFFFF"/>
+          </w:tcPr>
+          <w:p>
+            <w:r>
+              <w:rPr>
+                <w:rFonts w:ascii="Calibri" w:hAnsi="Calibri"/>
+                <w:sz w:val="19"/>
+              </w:rPr>
+              <w:t>• Stack of Maps (Symbol Table scope stack)</w:t>
+              <w:br/>
+              <w:t>• Map (Simulated memory offsets)</w:t>
+              <w:br/>
+              <w:t>• List (Compilation errors list)</w:t>
+            </w:r>
+          </w:p>
+        </w:tc>
+        <w:tc>
+          <w:tcPr>
+            <w:tcW w:type="dxa" w:w="2340"/>
+            <w:tcMar>
+              <w:top w:w="100" w:type="dxa"/>
+              <w:bottom w:w="100" w:type="dxa"/>
+              <w:left w:w="150" w:type="dxa"/>
+              <w:right w:w="150" w:type="dxa"/>
+            </w:tcMar>
+            <w:shd w:fill="FFFFFF"/>
+          </w:tcPr>
+          <w:p>
+            <w:r>
+              <w:rPr>
+                <w:rFonts w:ascii="Calibri" w:hAnsi="Calibri"/>
+                <w:sz w:val="19"/>
+              </w:rPr>
+              <w:t>06:30 - 13:00</w:t>
+            </w:r>
+          </w:p>
+        </w:tc>
+      </w:tr>
+    </w:tbl>
     <w:p>
       <w:r>
         <w:br w:type="page"/>
@@ -4487,7 +4790,7 @@
         <w:drawing>
           <wp:inline xmlns:a="http://schemas.openxmlformats.org/drawingml/2006/main" xmlns:pic="http://schemas.openxmlformats.org/drawingml/2006/picture">
             <wp:extent cx="5029200" cy="2670565"/>
-            <wp:docPr id="2" name="Picture 2"/>
+            <wp:docPr id="1" name="Picture 1"/>
             <wp:cNvGraphicFramePr>
               <a:graphicFrameLocks noChangeAspect="1"/>
             </wp:cNvGraphicFramePr>
@@ -4499,7 +4802,7 @@
                     <pic:cNvPicPr/>
                   </pic:nvPicPr>
                   <pic:blipFill>
-                    <a:blip r:embed="rId12"/>
+                    <a:blip r:embed="rId11"/>
                     <a:stretch>
                       <a:fillRect/>
                     </a:stretch>
@@ -4542,7 +4845,7 @@
         <w:drawing>
           <wp:inline xmlns:a="http://schemas.openxmlformats.org/drawingml/2006/main" xmlns:pic="http://schemas.openxmlformats.org/drawingml/2006/picture">
             <wp:extent cx="5029200" cy="2651561"/>
-            <wp:docPr id="3" name="Picture 3"/>
+            <wp:docPr id="2" name="Picture 2"/>
             <wp:cNvGraphicFramePr>
               <a:graphicFrameLocks noChangeAspect="1"/>
             </wp:cNvGraphicFramePr>
@@ -4554,7 +4857,7 @@
                     <pic:cNvPicPr/>
                   </pic:nvPicPr>
                   <pic:blipFill>
-                    <a:blip r:embed="rId13"/>
+                    <a:blip r:embed="rId12"/>
                     <a:stretch>
                       <a:fillRect/>
                     </a:stretch>
@@ -4597,7 +4900,7 @@
         <w:drawing>
           <wp:inline xmlns:a="http://schemas.openxmlformats.org/drawingml/2006/main" xmlns:pic="http://schemas.openxmlformats.org/drawingml/2006/picture">
             <wp:extent cx="5029200" cy="2668331"/>
-            <wp:docPr id="4" name="Picture 4"/>
+            <wp:docPr id="3" name="Picture 3"/>
             <wp:cNvGraphicFramePr>
               <a:graphicFrameLocks noChangeAspect="1"/>
             </wp:cNvGraphicFramePr>
@@ -4609,7 +4912,7 @@
                     <pic:cNvPicPr/>
                   </pic:nvPicPr>
                   <pic:blipFill>
-                    <a:blip r:embed="rId14"/>
+                    <a:blip r:embed="rId13"/>
                     <a:stretch>
                       <a:fillRect/>
                     </a:stretch>
@@ -4652,7 +4955,7 @@
         <w:drawing>
           <wp:inline xmlns:a="http://schemas.openxmlformats.org/drawingml/2006/main" xmlns:pic="http://schemas.openxmlformats.org/drawingml/2006/picture">
             <wp:extent cx="5029200" cy="2772648"/>
-            <wp:docPr id="5" name="Picture 5"/>
+            <wp:docPr id="4" name="Picture 4"/>
             <wp:cNvGraphicFramePr>
               <a:graphicFrameLocks noChangeAspect="1"/>
             </wp:cNvGraphicFramePr>
@@ -4664,7 +4967,7 @@
                     <pic:cNvPicPr/>
                   </pic:nvPicPr>
                   <pic:blipFill>
-                    <a:blip r:embed="rId15"/>
+                    <a:blip r:embed="rId14"/>
                     <a:stretch>
                       <a:fillRect/>
                     </a:stretch>
@@ -4725,7 +5028,7 @@
         <w:drawing>
           <wp:inline xmlns:a="http://schemas.openxmlformats.org/drawingml/2006/main" xmlns:pic="http://schemas.openxmlformats.org/drawingml/2006/picture">
             <wp:extent cx="5029200" cy="2547399"/>
-            <wp:docPr id="6" name="Picture 6"/>
+            <wp:docPr id="5" name="Picture 5"/>
             <wp:cNvGraphicFramePr>
               <a:graphicFrameLocks noChangeAspect="1"/>
             </wp:cNvGraphicFramePr>
@@ -4737,7 +5040,7 @@
                     <pic:cNvPicPr/>
                   </pic:nvPicPr>
                   <pic:blipFill>
-                    <a:blip r:embed="rId16"/>
+                    <a:blip r:embed="rId15"/>
                     <a:stretch>
                       <a:fillRect/>
                     </a:stretch>
@@ -4780,7 +5083,7 @@
         <w:drawing>
           <wp:inline xmlns:a="http://schemas.openxmlformats.org/drawingml/2006/main" xmlns:pic="http://schemas.openxmlformats.org/drawingml/2006/picture">
             <wp:extent cx="5029200" cy="2249185"/>
-            <wp:docPr id="7" name="Picture 7"/>
+            <wp:docPr id="6" name="Picture 6"/>
             <wp:cNvGraphicFramePr>
               <a:graphicFrameLocks noChangeAspect="1"/>
             </wp:cNvGraphicFramePr>
@@ -4792,7 +5095,7 @@
                     <pic:cNvPicPr/>
                   </pic:nvPicPr>
                   <pic:blipFill>
-                    <a:blip r:embed="rId17"/>
+                    <a:blip r:embed="rId16"/>
                     <a:stretch>
                       <a:fillRect/>
                     </a:stretch>
@@ -4835,7 +5138,7 @@
         <w:drawing>
           <wp:inline xmlns:a="http://schemas.openxmlformats.org/drawingml/2006/main" xmlns:pic="http://schemas.openxmlformats.org/drawingml/2006/picture">
             <wp:extent cx="5029200" cy="2806228"/>
-            <wp:docPr id="8" name="Picture 8"/>
+            <wp:docPr id="7" name="Picture 7"/>
             <wp:cNvGraphicFramePr>
               <a:graphicFrameLocks noChangeAspect="1"/>
             </wp:cNvGraphicFramePr>
@@ -4847,7 +5150,7 @@
                     <pic:cNvPicPr/>
                   </pic:nvPicPr>
                   <pic:blipFill>
-                    <a:blip r:embed="rId18"/>
+                    <a:blip r:embed="rId17"/>
                     <a:stretch>
                       <a:fillRect/>
                     </a:stretch>
@@ -4908,7 +5211,7 @@
         <w:drawing>
           <wp:inline xmlns:a="http://schemas.openxmlformats.org/drawingml/2006/main" xmlns:pic="http://schemas.openxmlformats.org/drawingml/2006/picture">
             <wp:extent cx="5029200" cy="2763057"/>
-            <wp:docPr id="9" name="Picture 9"/>
+            <wp:docPr id="8" name="Picture 8"/>
             <wp:cNvGraphicFramePr>
               <a:graphicFrameLocks noChangeAspect="1"/>
             </wp:cNvGraphicFramePr>
@@ -4920,7 +5223,7 @@
                     <pic:cNvPicPr/>
                   </pic:nvPicPr>
                   <pic:blipFill>
-                    <a:blip r:embed="rId19"/>
+                    <a:blip r:embed="rId18"/>
                     <a:stretch>
                       <a:fillRect/>
                     </a:stretch>
@@ -4963,7 +5266,7 @@
         <w:drawing>
           <wp:inline xmlns:a="http://schemas.openxmlformats.org/drawingml/2006/main" xmlns:pic="http://schemas.openxmlformats.org/drawingml/2006/picture">
             <wp:extent cx="5029200" cy="2263140"/>
-            <wp:docPr id="10" name="Picture 10"/>
+            <wp:docPr id="9" name="Picture 9"/>
             <wp:cNvGraphicFramePr>
               <a:graphicFrameLocks noChangeAspect="1"/>
             </wp:cNvGraphicFramePr>
@@ -4975,7 +5278,7 @@
                     <pic:cNvPicPr/>
                   </pic:nvPicPr>
                   <pic:blipFill>
-                    <a:blip r:embed="rId20"/>
+                    <a:blip r:embed="rId19"/>
                     <a:stretch>
                       <a:fillRect/>
                     </a:stretch>

</xml_diff>